<commit_message>
job aps cover letters and comp mod guest lecture
</commit_message>
<xml_diff>
--- a/documents/resumes/Mendelson CV field march 31 2026.docx
+++ b/documents/resumes/Mendelson CV field march 31 2026.docx
@@ -84,6 +84,14 @@
               </w:rPr>
               <w:t>Field Biologist</w:t>
             </w:r>
+            <w:r>
+              <w:rPr>
+                <w:rFonts w:ascii="Times New Roman" w:hAnsi="Times New Roman" w:cs="Times New Roman"/>
+                <w:sz w:val="24"/>
+                <w:szCs w:val="24"/>
+              </w:rPr>
+              <w:t>, Science Communicator</w:t>
+            </w:r>
           </w:p>
           <w:p>
             <w:pPr>
@@ -129,57 +137,12 @@
                 <w:sz w:val="24"/>
                 <w:szCs w:val="24"/>
               </w:rPr>
-              <w:t>alex.mendelson.698@my.csun.edu</w:t>
+              <w:t>alexofecology@gmail.com</w:t>
             </w:r>
           </w:p>
         </w:tc>
       </w:tr>
     </w:tbl>
-    <w:p>
-      <w:pPr>
-        <w:pBdr>
-          <w:bottom w:val="single" w:sz="6" w:space="1" w:color="auto"/>
-        </w:pBdr>
-        <w:rPr>
-          <w:rFonts w:ascii="Avenir Next LT Pro" w:hAnsi="Avenir Next LT Pro"/>
-          <w:color w:val="538135" w:themeColor="accent6" w:themeShade="BF"/>
-        </w:rPr>
-      </w:pPr>
-    </w:p>
-    <w:p>
-      <w:pPr>
-        <w:rPr>
-          <w:rFonts w:ascii="Avenir Next LT Pro" w:hAnsi="Avenir Next LT Pro"/>
-          <w:color w:val="538135" w:themeColor="accent6" w:themeShade="BF"/>
-          <w:sz w:val="32"/>
-          <w:szCs w:val="32"/>
-        </w:rPr>
-      </w:pPr>
-      <w:r>
-        <w:rPr>
-          <w:rFonts w:ascii="Times New Roman" w:hAnsi="Times New Roman" w:cs="Times New Roman"/>
-        </w:rPr>
-        <w:t>F</w:t>
-      </w:r>
-      <w:r>
-        <w:rPr>
-          <w:rFonts w:ascii="Times New Roman" w:hAnsi="Times New Roman" w:cs="Times New Roman"/>
-        </w:rPr>
-        <w:t xml:space="preserve">ield biologist with experience in California vegetation and wildlife surveys, coastal restoration, and construction-adjacent monitoring. Skilled in transect-based surveys, habitat assessment, and environmental data collection under variable field conditions. Strong background in data analysis (R, Python) and technical </w:t>
-      </w:r>
-      <w:r>
-        <w:rPr>
-          <w:rFonts w:ascii="Times New Roman" w:hAnsi="Times New Roman" w:cs="Times New Roman"/>
-        </w:rPr>
-        <w:t>writing</w:t>
-      </w:r>
-      <w:r>
-        <w:rPr>
-          <w:rFonts w:ascii="Times New Roman" w:hAnsi="Times New Roman" w:cs="Times New Roman"/>
-        </w:rPr>
-        <w:t>, with the ability to work independently, travel, and collaborate with multidisciplinary field teams. Seeking to transition into environmental consulting and compliance-focused fieldwork.</w:t>
-      </w:r>
-    </w:p>
     <w:p>
       <w:pPr>
         <w:pBdr>
@@ -1305,7 +1268,6 @@
           <w:sz w:val="32"/>
           <w:szCs w:val="32"/>
         </w:rPr>
-        <w:lastRenderedPageBreak/>
         <w:t>Professional Service</w:t>
       </w:r>
     </w:p>
@@ -1466,13 +1428,8 @@
           <w:sz w:val="32"/>
           <w:szCs w:val="32"/>
         </w:rPr>
-        <w:t>Research</w:t>
-      </w:r>
-      <w:r>
-        <w:rPr>
-          <w:color w:val="538135" w:themeColor="accent6" w:themeShade="BF"/>
-        </w:rPr>
-        <w:t xml:space="preserve"> </w:t>
+        <w:lastRenderedPageBreak/>
+        <w:t>Researc</w:t>
       </w:r>
       <w:r>
         <w:rPr>
@@ -1481,6 +1438,15 @@
           <w:sz w:val="32"/>
           <w:szCs w:val="32"/>
         </w:rPr>
+        <w:t xml:space="preserve">h and Teaching </w:t>
+      </w:r>
+      <w:r>
+        <w:rPr>
+          <w:rFonts w:ascii="Avenir Next LT Pro" w:hAnsi="Avenir Next LT Pro"/>
+          <w:color w:val="538135" w:themeColor="accent6" w:themeShade="BF"/>
+          <w:sz w:val="32"/>
+          <w:szCs w:val="32"/>
+        </w:rPr>
         <w:t>Experience</w:t>
       </w:r>
     </w:p>
@@ -1503,6 +1469,16 @@
           <w:szCs w:val="24"/>
         </w:rPr>
         <w:t>Graduate Research</w:t>
+      </w:r>
+      <w:r>
+        <w:rPr>
+          <w:rFonts w:ascii="Times New Roman" w:hAnsi="Times New Roman" w:cs="Times New Roman"/>
+          <w:b/>
+          <w:bCs/>
+          <w:sz w:val="24"/>
+          <w:szCs w:val="24"/>
+        </w:rPr>
+        <w:t>er</w:t>
       </w:r>
       <w:r>
         <w:rPr>
@@ -1665,6 +1641,338 @@
     <w:p>
       <w:pPr>
         <w:tabs>
+          <w:tab w:val="left" w:pos="567"/>
+          <w:tab w:val="right" w:pos="9090"/>
+          <w:tab w:val="right" w:pos="9360"/>
+        </w:tabs>
+        <w:spacing w:after="120" w:line="240" w:lineRule="auto"/>
+        <w:rPr>
+          <w:rFonts w:ascii="Times New Roman" w:hAnsi="Times New Roman" w:cs="Times New Roman"/>
+          <w:i/>
+          <w:iCs/>
+        </w:rPr>
+      </w:pPr>
+      <w:r>
+        <w:rPr>
+          <w:rFonts w:ascii="Times New Roman" w:hAnsi="Times New Roman" w:cs="Times New Roman"/>
+          <w:b/>
+          <w:bCs/>
+          <w:sz w:val="24"/>
+          <w:szCs w:val="24"/>
+        </w:rPr>
+        <w:t>Teaching Associate</w:t>
+      </w:r>
+      <w:r>
+        <w:rPr>
+          <w:rFonts w:ascii="Times New Roman" w:hAnsi="Times New Roman" w:cs="Times New Roman"/>
+          <w:sz w:val="24"/>
+          <w:szCs w:val="24"/>
+        </w:rPr>
+        <w:t xml:space="preserve"> </w:t>
+      </w:r>
+      <w:r>
+        <w:rPr>
+          <w:rFonts w:ascii="Times New Roman" w:hAnsi="Times New Roman" w:cs="Times New Roman"/>
+          <w:sz w:val="24"/>
+          <w:szCs w:val="24"/>
+        </w:rPr>
+        <w:t>(</w:t>
+      </w:r>
+      <w:r>
+        <w:rPr>
+          <w:rFonts w:ascii="Times New Roman" w:hAnsi="Times New Roman" w:cs="Times New Roman"/>
+        </w:rPr>
+        <w:t>instructor of record</w:t>
+      </w:r>
+      <w:r>
+        <w:rPr>
+          <w:rFonts w:ascii="Times New Roman" w:hAnsi="Times New Roman" w:cs="Times New Roman"/>
+        </w:rPr>
+        <w:t>)</w:t>
+      </w:r>
+      <w:r>
+        <w:rPr>
+          <w:rFonts w:ascii="Times New Roman" w:hAnsi="Times New Roman" w:cs="Times New Roman"/>
+        </w:rPr>
+        <w:br/>
+      </w:r>
+      <w:r>
+        <w:rPr>
+          <w:rFonts w:ascii="Times New Roman" w:hAnsi="Times New Roman" w:cs="Times New Roman"/>
+        </w:rPr>
+        <w:t>California State University, Northridge</w:t>
+      </w:r>
+      <w:r>
+        <w:rPr>
+          <w:rFonts w:ascii="Times New Roman" w:hAnsi="Times New Roman" w:cs="Times New Roman"/>
+        </w:rPr>
+        <w:tab/>
+        <w:t>2023–</w:t>
+      </w:r>
+      <w:r>
+        <w:rPr>
+          <w:rFonts w:ascii="Times New Roman" w:hAnsi="Times New Roman" w:cs="Times New Roman"/>
+        </w:rPr>
+        <w:t>present</w:t>
+      </w:r>
+    </w:p>
+    <w:p>
+      <w:pPr>
+        <w:pStyle w:val="ListParagraph"/>
+        <w:numPr>
+          <w:ilvl w:val="0"/>
+          <w:numId w:val="10"/>
+        </w:numPr>
+        <w:tabs>
+          <w:tab w:val="left" w:pos="450"/>
+          <w:tab w:val="right" w:pos="9090"/>
+          <w:tab w:val="right" w:pos="9360"/>
+        </w:tabs>
+        <w:spacing w:after="120" w:line="240" w:lineRule="auto"/>
+        <w:ind w:hanging="540"/>
+        <w:rPr>
+          <w:rFonts w:ascii="Times New Roman" w:hAnsi="Times New Roman" w:cs="Times New Roman"/>
+          <w:i/>
+          <w:iCs/>
+        </w:rPr>
+      </w:pPr>
+      <w:r>
+        <w:rPr>
+          <w:rFonts w:ascii="Times New Roman" w:hAnsi="Times New Roman" w:cs="Times New Roman"/>
+        </w:rPr>
+        <w:t>Taught introductory biology lab courses for majors and non-majors (&gt;20 sections total)</w:t>
+      </w:r>
+    </w:p>
+    <w:p>
+      <w:pPr>
+        <w:pStyle w:val="ListParagraph"/>
+        <w:numPr>
+          <w:ilvl w:val="0"/>
+          <w:numId w:val="10"/>
+        </w:numPr>
+        <w:tabs>
+          <w:tab w:val="left" w:pos="450"/>
+          <w:tab w:val="right" w:pos="9090"/>
+          <w:tab w:val="right" w:pos="9360"/>
+        </w:tabs>
+        <w:spacing w:after="120" w:line="240" w:lineRule="auto"/>
+        <w:ind w:hanging="540"/>
+        <w:rPr>
+          <w:rFonts w:ascii="Times New Roman" w:hAnsi="Times New Roman" w:cs="Times New Roman"/>
+          <w:i/>
+          <w:iCs/>
+        </w:rPr>
+      </w:pPr>
+      <w:r>
+        <w:rPr>
+          <w:rFonts w:ascii="Times New Roman" w:hAnsi="Times New Roman" w:cs="Times New Roman"/>
+        </w:rPr>
+        <w:t>Topics: cell biology, microbiology, evolution, ecology, conservation, phylogenetics</w:t>
+      </w:r>
+    </w:p>
+    <w:p>
+      <w:pPr>
+        <w:pStyle w:val="ListParagraph"/>
+        <w:numPr>
+          <w:ilvl w:val="0"/>
+          <w:numId w:val="10"/>
+        </w:numPr>
+        <w:tabs>
+          <w:tab w:val="left" w:pos="450"/>
+          <w:tab w:val="right" w:pos="9090"/>
+          <w:tab w:val="right" w:pos="9360"/>
+        </w:tabs>
+        <w:spacing w:after="120" w:line="240" w:lineRule="auto"/>
+        <w:ind w:hanging="540"/>
+        <w:rPr>
+          <w:rFonts w:ascii="Times New Roman" w:hAnsi="Times New Roman" w:cs="Times New Roman"/>
+          <w:i/>
+          <w:iCs/>
+        </w:rPr>
+      </w:pPr>
+      <w:r>
+        <w:rPr>
+          <w:rFonts w:ascii="Times New Roman" w:hAnsi="Times New Roman" w:cs="Times New Roman"/>
+        </w:rPr>
+        <w:t>Produced formative assessments and served as a leader for other instructors</w:t>
+      </w:r>
+    </w:p>
+    <w:p>
+      <w:pPr>
+        <w:pStyle w:val="ListParagraph"/>
+        <w:numPr>
+          <w:ilvl w:val="0"/>
+          <w:numId w:val="10"/>
+        </w:numPr>
+        <w:tabs>
+          <w:tab w:val="left" w:pos="450"/>
+          <w:tab w:val="right" w:pos="9090"/>
+          <w:tab w:val="right" w:pos="9360"/>
+        </w:tabs>
+        <w:spacing w:after="120" w:line="240" w:lineRule="auto"/>
+        <w:ind w:hanging="540"/>
+        <w:rPr>
+          <w:rFonts w:ascii="Times New Roman" w:hAnsi="Times New Roman" w:cs="Times New Roman"/>
+          <w:i/>
+          <w:iCs/>
+        </w:rPr>
+      </w:pPr>
+      <w:r>
+        <w:rPr>
+          <w:rFonts w:ascii="Times New Roman" w:hAnsi="Times New Roman" w:cs="Times New Roman"/>
+        </w:rPr>
+        <w:t>Mentored students in scientific literacy and communication</w:t>
+      </w:r>
+    </w:p>
+    <w:p>
+      <w:pPr>
+        <w:tabs>
+          <w:tab w:val="left" w:pos="567"/>
+          <w:tab w:val="left" w:pos="720"/>
+          <w:tab w:val="right" w:pos="9090"/>
+          <w:tab w:val="right" w:pos="9360"/>
+        </w:tabs>
+        <w:spacing w:after="120" w:line="240" w:lineRule="auto"/>
+        <w:rPr>
+          <w:rFonts w:ascii="Times New Roman" w:hAnsi="Times New Roman" w:cs="Times New Roman"/>
+          <w:i/>
+          <w:iCs/>
+        </w:rPr>
+      </w:pPr>
+      <w:r>
+        <w:rPr>
+          <w:rFonts w:ascii="Times New Roman" w:hAnsi="Times New Roman" w:cs="Times New Roman"/>
+          <w:b/>
+          <w:bCs/>
+          <w:sz w:val="24"/>
+          <w:szCs w:val="24"/>
+        </w:rPr>
+        <w:t>Graduate Assistant, Statistics</w:t>
+      </w:r>
+      <w:r>
+        <w:rPr>
+          <w:rFonts w:ascii="Times New Roman" w:hAnsi="Times New Roman" w:cs="Times New Roman"/>
+          <w:sz w:val="24"/>
+          <w:szCs w:val="24"/>
+        </w:rPr>
+        <w:br/>
+      </w:r>
+      <w:r>
+        <w:rPr>
+          <w:rFonts w:ascii="Times New Roman" w:hAnsi="Times New Roman" w:cs="Times New Roman"/>
+        </w:rPr>
+        <w:t>California State University, Northridge</w:t>
+      </w:r>
+      <w:r>
+        <w:rPr>
+          <w:rFonts w:ascii="Times New Roman" w:hAnsi="Times New Roman" w:cs="Times New Roman"/>
+          <w:sz w:val="24"/>
+          <w:szCs w:val="24"/>
+        </w:rPr>
+        <w:tab/>
+      </w:r>
+      <w:r>
+        <w:rPr>
+          <w:rFonts w:ascii="Times New Roman" w:hAnsi="Times New Roman" w:cs="Times New Roman"/>
+        </w:rPr>
+        <w:t>2025–2025</w:t>
+      </w:r>
+    </w:p>
+    <w:p>
+      <w:pPr>
+        <w:pStyle w:val="ListParagraph"/>
+        <w:numPr>
+          <w:ilvl w:val="0"/>
+          <w:numId w:val="11"/>
+        </w:numPr>
+        <w:tabs>
+          <w:tab w:val="left" w:pos="450"/>
+          <w:tab w:val="left" w:pos="720"/>
+          <w:tab w:val="right" w:pos="9090"/>
+          <w:tab w:val="right" w:pos="9360"/>
+        </w:tabs>
+        <w:spacing w:after="120" w:line="240" w:lineRule="auto"/>
+        <w:ind w:hanging="540"/>
+        <w:rPr>
+          <w:rFonts w:ascii="Times New Roman" w:hAnsi="Times New Roman" w:cs="Times New Roman"/>
+        </w:rPr>
+      </w:pPr>
+      <w:r>
+        <w:rPr>
+          <w:rFonts w:ascii="Times New Roman" w:hAnsi="Times New Roman" w:cs="Times New Roman"/>
+        </w:rPr>
+        <w:t>Assistant to the instructor for Biometry, a graduate-level bio-statistics course</w:t>
+      </w:r>
+    </w:p>
+    <w:p>
+      <w:pPr>
+        <w:pStyle w:val="ListParagraph"/>
+        <w:numPr>
+          <w:ilvl w:val="0"/>
+          <w:numId w:val="11"/>
+        </w:numPr>
+        <w:tabs>
+          <w:tab w:val="left" w:pos="450"/>
+          <w:tab w:val="left" w:pos="720"/>
+          <w:tab w:val="right" w:pos="9090"/>
+          <w:tab w:val="right" w:pos="9360"/>
+        </w:tabs>
+        <w:spacing w:after="120" w:line="240" w:lineRule="auto"/>
+        <w:ind w:hanging="540"/>
+        <w:rPr>
+          <w:rFonts w:ascii="Times New Roman" w:hAnsi="Times New Roman" w:cs="Times New Roman"/>
+        </w:rPr>
+      </w:pPr>
+      <w:r>
+        <w:rPr>
+          <w:rFonts w:ascii="Times New Roman" w:hAnsi="Times New Roman" w:cs="Times New Roman"/>
+        </w:rPr>
+        <w:t>Topics: introduction to statistics and probability</w:t>
+      </w:r>
+      <w:proofErr w:type="gramStart"/>
+      <w:r>
+        <w:rPr>
+          <w:rFonts w:ascii="Times New Roman" w:hAnsi="Times New Roman" w:cs="Times New Roman"/>
+        </w:rPr>
+        <w:t>, to</w:t>
+      </w:r>
+      <w:proofErr w:type="gramEnd"/>
+      <w:r>
+        <w:rPr>
+          <w:rFonts w:ascii="Times New Roman" w:hAnsi="Times New Roman" w:cs="Times New Roman"/>
+        </w:rPr>
+        <w:t xml:space="preserve"> advanced multivariate analyses</w:t>
+      </w:r>
+    </w:p>
+    <w:p>
+      <w:pPr>
+        <w:pStyle w:val="ListParagraph"/>
+        <w:numPr>
+          <w:ilvl w:val="0"/>
+          <w:numId w:val="11"/>
+        </w:numPr>
+        <w:tabs>
+          <w:tab w:val="left" w:pos="450"/>
+          <w:tab w:val="left" w:pos="720"/>
+          <w:tab w:val="right" w:pos="9090"/>
+          <w:tab w:val="right" w:pos="9360"/>
+        </w:tabs>
+        <w:spacing w:after="120" w:line="240" w:lineRule="auto"/>
+        <w:ind w:hanging="540"/>
+        <w:rPr>
+          <w:rFonts w:ascii="Times New Roman" w:hAnsi="Times New Roman" w:cs="Times New Roman"/>
+        </w:rPr>
+      </w:pPr>
+      <w:r>
+        <w:rPr>
+          <w:rFonts w:ascii="Times New Roman" w:hAnsi="Times New Roman" w:cs="Times New Roman"/>
+        </w:rPr>
+        <w:t>Hold office hours and assist with assignment design and grading</w:t>
+      </w:r>
+    </w:p>
+    <w:p>
+      <w:pPr>
+        <w:tabs>
           <w:tab w:val="right" w:pos="9072"/>
         </w:tabs>
         <w:spacing w:line="240" w:lineRule="auto"/>
@@ -1829,23 +2137,61 @@
         <w:ind w:left="720" w:hanging="720"/>
         <w:rPr>
           <w:rFonts w:ascii="Times New Roman" w:hAnsi="Times New Roman" w:cs="Times New Roman"/>
+        </w:rPr>
+      </w:pPr>
+      <w:r>
+        <w:rPr>
+          <w:rFonts w:ascii="Times New Roman" w:hAnsi="Times New Roman" w:cs="Times New Roman"/>
           <w:b/>
           <w:bCs/>
         </w:rPr>
-      </w:pPr>
+        <w:t>Mendelson, A. A*.</w:t>
+      </w:r>
+      <w:r>
+        <w:rPr>
+          <w:rFonts w:ascii="Times New Roman" w:hAnsi="Times New Roman" w:cs="Times New Roman"/>
+        </w:rPr>
+        <w:t xml:space="preserve">, C. P. terHorst, 2026. </w:t>
+      </w:r>
+      <w:r>
+        <w:rPr>
+          <w:rFonts w:ascii="Times New Roman" w:hAnsi="Times New Roman" w:cs="Times New Roman"/>
+        </w:rPr>
+        <w:t>Adaptation to climate change and its indirect effects on rotifer ecology</w:t>
+      </w:r>
+      <w:r>
+        <w:rPr>
+          <w:rFonts w:ascii="Times New Roman" w:hAnsi="Times New Roman" w:cs="Times New Roman"/>
+        </w:rPr>
+        <w:t>. Southern California Academy of Sciences, Anaheim, CA [</w:t>
+      </w:r>
       <w:r>
         <w:rPr>
           <w:rFonts w:ascii="Times New Roman" w:hAnsi="Times New Roman" w:cs="Times New Roman"/>
           <w:b/>
           <w:bCs/>
         </w:rPr>
-        <w:t>Mendelson, A. A*.</w:t>
-      </w:r>
-      <w:r>
-        <w:rPr>
-          <w:rFonts w:ascii="Times New Roman" w:hAnsi="Times New Roman" w:cs="Times New Roman"/>
-        </w:rPr>
-        <w:t>, C. P. terHorst.</w:t>
+        <w:t>talk</w:t>
+      </w:r>
+      <w:r>
+        <w:rPr>
+          <w:rFonts w:ascii="Times New Roman" w:hAnsi="Times New Roman" w:cs="Times New Roman"/>
+        </w:rPr>
+        <w:t xml:space="preserve">]; </w:t>
+      </w:r>
+      <w:proofErr w:type="spellStart"/>
+      <w:r>
+        <w:rPr>
+          <w:rFonts w:ascii="Times New Roman" w:hAnsi="Times New Roman" w:cs="Times New Roman"/>
+        </w:rPr>
+        <w:t>CSUNposium</w:t>
+      </w:r>
+      <w:proofErr w:type="spellEnd"/>
+      <w:r>
+        <w:rPr>
+          <w:rFonts w:ascii="Times New Roman" w:hAnsi="Times New Roman" w:cs="Times New Roman"/>
+        </w:rPr>
+        <w:t>, Northridge, CA [</w:t>
       </w:r>
       <w:r>
         <w:rPr>
@@ -1853,20 +2199,58 @@
           <w:b/>
           <w:bCs/>
         </w:rPr>
-        <w:t xml:space="preserve"> </w:t>
-      </w:r>
-      <w:r>
-        <w:rPr>
-          <w:rFonts w:ascii="Times New Roman" w:hAnsi="Times New Roman" w:cs="Times New Roman"/>
-        </w:rPr>
-        <w:t>2025. The search for indirect ecological effect of evolution in pitcher plant rotifers. Western Society of Naturalists, San Diego, CA [</w:t>
-      </w:r>
-      <w:r>
+        <w:t>talk</w:t>
+      </w:r>
+      <w:r>
+        <w:rPr>
+          <w:rFonts w:ascii="Times New Roman" w:hAnsi="Times New Roman" w:cs="Times New Roman"/>
+        </w:rPr>
+        <w:t>]</w:t>
+      </w:r>
+    </w:p>
+    <w:p>
+      <w:pPr>
+        <w:ind w:left="720" w:hanging="720"/>
         <w:rPr>
           <w:rFonts w:ascii="Times New Roman" w:hAnsi="Times New Roman" w:cs="Times New Roman"/>
           <w:b/>
           <w:bCs/>
         </w:rPr>
+      </w:pPr>
+      <w:r>
+        <w:rPr>
+          <w:rFonts w:ascii="Times New Roman" w:hAnsi="Times New Roman" w:cs="Times New Roman"/>
+          <w:b/>
+          <w:bCs/>
+        </w:rPr>
+        <w:t>Mendelson, A. A*.</w:t>
+      </w:r>
+      <w:r>
+        <w:rPr>
+          <w:rFonts w:ascii="Times New Roman" w:hAnsi="Times New Roman" w:cs="Times New Roman"/>
+        </w:rPr>
+        <w:t>, C. P. terHorst.</w:t>
+      </w:r>
+      <w:r>
+        <w:rPr>
+          <w:rFonts w:ascii="Times New Roman" w:hAnsi="Times New Roman" w:cs="Times New Roman"/>
+          <w:b/>
+          <w:bCs/>
+        </w:rPr>
+        <w:t xml:space="preserve"> </w:t>
+      </w:r>
+      <w:r>
+        <w:rPr>
+          <w:rFonts w:ascii="Times New Roman" w:hAnsi="Times New Roman" w:cs="Times New Roman"/>
+        </w:rPr>
+        <w:t>2025. The search for indirect ecological effect of evolution in pitcher plant rotifers. Western Society of Naturalists, San Diego, CA [</w:t>
+      </w:r>
+      <w:r>
+        <w:rPr>
+          <w:rFonts w:ascii="Times New Roman" w:hAnsi="Times New Roman" w:cs="Times New Roman"/>
+          <w:b/>
+          <w:bCs/>
+        </w:rPr>
         <w:t>talk</w:t>
       </w:r>
       <w:r>
@@ -2271,7 +2655,14 @@
         <w:rPr>
           <w:rFonts w:ascii="Times New Roman" w:hAnsi="Times New Roman" w:cs="Times New Roman"/>
         </w:rPr>
-        <w:t xml:space="preserve"> Western Society of Naturalists, Monterey, CA [</w:t>
+        <w:t xml:space="preserve"> Western Society of </w:t>
+      </w:r>
+      <w:r>
+        <w:rPr>
+          <w:rFonts w:ascii="Times New Roman" w:hAnsi="Times New Roman" w:cs="Times New Roman"/>
+        </w:rPr>
+        <w:lastRenderedPageBreak/>
+        <w:t>Naturalists, Monterey, CA [</w:t>
       </w:r>
       <w:r>
         <w:rPr>
@@ -2590,7 +2981,7 @@
       <w:rPr>
         <w:rFonts w:ascii="Times New Roman" w:hAnsi="Times New Roman" w:cs="Times New Roman"/>
       </w:rPr>
-      <w:t>Mar</w:t>
+      <w:t>Apr</w:t>
     </w:r>
     <w:r>
       <w:rPr>
@@ -2623,6 +3014,119 @@
 <file path=word/numbering.xml><?xml version="1.0" encoding="utf-8"?>
 <w:numbering xmlns:wpc="http://schemas.microsoft.com/office/word/2010/wordprocessingCanvas" xmlns:cx="http://schemas.microsoft.com/office/drawing/2014/chartex" xmlns:cx1="http://schemas.microsoft.com/office/drawing/2015/9/8/chartex" xmlns:cx2="http://schemas.microsoft.com/office/drawing/2015/10/21/chartex" xmlns:cx3="http://schemas.microsoft.com/office/drawing/2016/5/9/chartex" xmlns:cx4="http://schemas.microsoft.com/office/drawing/2016/5/10/chartex" xmlns:cx5="http://schemas.microsoft.com/office/drawing/2016/5/11/chartex" xmlns:cx6="http://schemas.microsoft.com/office/drawing/2016/5/12/chartex" xmlns:cx7="http://schemas.microsoft.com/office/drawing/2016/5/13/chartex" xmlns:cx8="http://schemas.microsoft.com/office/drawing/2016/5/14/chartex" xmlns:mc="http://schemas.openxmlformats.org/markup-compatibility/2006" xmlns:aink="http://schemas.microsoft.com/office/drawing/2016/ink" xmlns:am3d="http://schemas.microsoft.com/office/drawing/2017/model3d" xmlns:o="urn:schemas-microsoft-com:office:office" xmlns:oel="http://schemas.microsoft.com/office/2019/extlst" xmlns:r="http://schemas.openxmlformats.org/officeDocument/2006/relationships" xmlns:m="http://schemas.openxmlformats.org/officeDocument/2006/math" xmlns:v="urn:schemas-microsoft-com:vml" xmlns:wp14="http://schemas.microsoft.com/office/word/2010/wordprocessingDrawing" xmlns:wp="http://schemas.openxmlformats.org/drawingml/2006/wordprocessingDrawing" xmlns:w10="urn:schemas-microsoft-com:office:word" xmlns:w="http://schemas.openxmlformats.org/wordprocessingml/2006/main" xmlns:w14="http://schemas.microsoft.com/office/word/2010/wordml" xmlns:w15="http://schemas.microsoft.com/office/word/2012/wordml" xmlns:w16cex="http://schemas.microsoft.com/office/word/2018/wordml/cex" xmlns:w16cid="http://schemas.microsoft.com/office/word/2016/wordml/cid" xmlns:w16="http://schemas.microsoft.com/office/word/2018/wordml" xmlns:w16du="http://schemas.microsoft.com/office/word/2023/wordml/word16du" xmlns:w16sdtdh="http://schemas.microsoft.com/office/word/2020/wordml/sdtdatahash" xmlns:w16sdtfl="http://schemas.microsoft.com/office/word/2024/wordml/sdtformatlock" xmlns:w16se="http://schemas.microsoft.com/office/word/2015/wordml/symex" xmlns:wpg="http://schemas.microsoft.com/office/word/2010/wordprocessingGroup" xmlns:wpi="http://schemas.microsoft.com/office/word/2010/wordprocessingInk" xmlns:wne="http://schemas.microsoft.com/office/word/2006/wordml" xmlns:wps="http://schemas.microsoft.com/office/word/2010/wordprocessingShape" mc:Ignorable="w14 w15 w16se w16cid w16 w16cex w16sdtdh w16sdtfl w16du wp14">
   <w:abstractNum w:abstractNumId="0" w15:restartNumberingAfterBreak="0">
+    <w:nsid w:val="013168FD"/>
+    <w:multiLevelType w:val="hybridMultilevel"/>
+    <w:tmpl w:val="1C5663F8"/>
+    <w:lvl w:ilvl="0" w:tplc="04090001">
+      <w:start w:val="1"/>
+      <w:numFmt w:val="bullet"/>
+      <w:lvlText w:val=""/>
+      <w:lvlJc w:val="left"/>
+      <w:pPr>
+        <w:ind w:left="720" w:hanging="360"/>
+      </w:pPr>
+      <w:rPr>
+        <w:rFonts w:ascii="Symbol" w:hAnsi="Symbol" w:hint="default"/>
+      </w:rPr>
+    </w:lvl>
+    <w:lvl w:ilvl="1" w:tplc="04090003" w:tentative="1">
+      <w:start w:val="1"/>
+      <w:numFmt w:val="bullet"/>
+      <w:lvlText w:val="o"/>
+      <w:lvlJc w:val="left"/>
+      <w:pPr>
+        <w:ind w:left="1440" w:hanging="360"/>
+      </w:pPr>
+      <w:rPr>
+        <w:rFonts w:ascii="Courier New" w:hAnsi="Courier New" w:cs="Courier New" w:hint="default"/>
+      </w:rPr>
+    </w:lvl>
+    <w:lvl w:ilvl="2" w:tplc="04090005" w:tentative="1">
+      <w:start w:val="1"/>
+      <w:numFmt w:val="bullet"/>
+      <w:lvlText w:val=""/>
+      <w:lvlJc w:val="left"/>
+      <w:pPr>
+        <w:ind w:left="2160" w:hanging="360"/>
+      </w:pPr>
+      <w:rPr>
+        <w:rFonts w:ascii="Wingdings" w:hAnsi="Wingdings" w:hint="default"/>
+      </w:rPr>
+    </w:lvl>
+    <w:lvl w:ilvl="3" w:tplc="04090001" w:tentative="1">
+      <w:start w:val="1"/>
+      <w:numFmt w:val="bullet"/>
+      <w:lvlText w:val=""/>
+      <w:lvlJc w:val="left"/>
+      <w:pPr>
+        <w:ind w:left="2880" w:hanging="360"/>
+      </w:pPr>
+      <w:rPr>
+        <w:rFonts w:ascii="Symbol" w:hAnsi="Symbol" w:hint="default"/>
+      </w:rPr>
+    </w:lvl>
+    <w:lvl w:ilvl="4" w:tplc="04090003" w:tentative="1">
+      <w:start w:val="1"/>
+      <w:numFmt w:val="bullet"/>
+      <w:lvlText w:val="o"/>
+      <w:lvlJc w:val="left"/>
+      <w:pPr>
+        <w:ind w:left="3600" w:hanging="360"/>
+      </w:pPr>
+      <w:rPr>
+        <w:rFonts w:ascii="Courier New" w:hAnsi="Courier New" w:cs="Courier New" w:hint="default"/>
+      </w:rPr>
+    </w:lvl>
+    <w:lvl w:ilvl="5" w:tplc="04090005" w:tentative="1">
+      <w:start w:val="1"/>
+      <w:numFmt w:val="bullet"/>
+      <w:lvlText w:val=""/>
+      <w:lvlJc w:val="left"/>
+      <w:pPr>
+        <w:ind w:left="4320" w:hanging="360"/>
+      </w:pPr>
+      <w:rPr>
+        <w:rFonts w:ascii="Wingdings" w:hAnsi="Wingdings" w:hint="default"/>
+      </w:rPr>
+    </w:lvl>
+    <w:lvl w:ilvl="6" w:tplc="04090001" w:tentative="1">
+      <w:start w:val="1"/>
+      <w:numFmt w:val="bullet"/>
+      <w:lvlText w:val=""/>
+      <w:lvlJc w:val="left"/>
+      <w:pPr>
+        <w:ind w:left="5040" w:hanging="360"/>
+      </w:pPr>
+      <w:rPr>
+        <w:rFonts w:ascii="Symbol" w:hAnsi="Symbol" w:hint="default"/>
+      </w:rPr>
+    </w:lvl>
+    <w:lvl w:ilvl="7" w:tplc="04090003" w:tentative="1">
+      <w:start w:val="1"/>
+      <w:numFmt w:val="bullet"/>
+      <w:lvlText w:val="o"/>
+      <w:lvlJc w:val="left"/>
+      <w:pPr>
+        <w:ind w:left="5760" w:hanging="360"/>
+      </w:pPr>
+      <w:rPr>
+        <w:rFonts w:ascii="Courier New" w:hAnsi="Courier New" w:cs="Courier New" w:hint="default"/>
+      </w:rPr>
+    </w:lvl>
+    <w:lvl w:ilvl="8" w:tplc="04090005" w:tentative="1">
+      <w:start w:val="1"/>
+      <w:numFmt w:val="bullet"/>
+      <w:lvlText w:val=""/>
+      <w:lvlJc w:val="left"/>
+      <w:pPr>
+        <w:ind w:left="6480" w:hanging="360"/>
+      </w:pPr>
+      <w:rPr>
+        <w:rFonts w:ascii="Wingdings" w:hAnsi="Wingdings" w:hint="default"/>
+      </w:rPr>
+    </w:lvl>
+  </w:abstractNum>
+  <w:abstractNum w:abstractNumId="1" w15:restartNumberingAfterBreak="0">
     <w:nsid w:val="37E911F0"/>
     <w:multiLevelType w:val="hybridMultilevel"/>
     <w:tmpl w:val="A55C2F6A"/>
@@ -2735,7 +3239,7 @@
       </w:rPr>
     </w:lvl>
   </w:abstractNum>
-  <w:abstractNum w:abstractNumId="1" w15:restartNumberingAfterBreak="0">
+  <w:abstractNum w:abstractNumId="2" w15:restartNumberingAfterBreak="0">
     <w:nsid w:val="388B6BD9"/>
     <w:multiLevelType w:val="hybridMultilevel"/>
     <w:tmpl w:val="5A2A5E12"/>
@@ -2850,7 +3354,120 @@
       </w:rPr>
     </w:lvl>
   </w:abstractNum>
-  <w:abstractNum w:abstractNumId="2" w15:restartNumberingAfterBreak="0">
+  <w:abstractNum w:abstractNumId="3" w15:restartNumberingAfterBreak="0">
+    <w:nsid w:val="3BDF0957"/>
+    <w:multiLevelType w:val="hybridMultilevel"/>
+    <w:tmpl w:val="0C8E17B6"/>
+    <w:lvl w:ilvl="0" w:tplc="04090001">
+      <w:start w:val="1"/>
+      <w:numFmt w:val="bullet"/>
+      <w:lvlText w:val=""/>
+      <w:lvlJc w:val="left"/>
+      <w:pPr>
+        <w:ind w:left="720" w:hanging="360"/>
+      </w:pPr>
+      <w:rPr>
+        <w:rFonts w:ascii="Symbol" w:hAnsi="Symbol" w:hint="default"/>
+      </w:rPr>
+    </w:lvl>
+    <w:lvl w:ilvl="1" w:tplc="04090003" w:tentative="1">
+      <w:start w:val="1"/>
+      <w:numFmt w:val="bullet"/>
+      <w:lvlText w:val="o"/>
+      <w:lvlJc w:val="left"/>
+      <w:pPr>
+        <w:ind w:left="1440" w:hanging="360"/>
+      </w:pPr>
+      <w:rPr>
+        <w:rFonts w:ascii="Courier New" w:hAnsi="Courier New" w:cs="Courier New" w:hint="default"/>
+      </w:rPr>
+    </w:lvl>
+    <w:lvl w:ilvl="2" w:tplc="04090005" w:tentative="1">
+      <w:start w:val="1"/>
+      <w:numFmt w:val="bullet"/>
+      <w:lvlText w:val=""/>
+      <w:lvlJc w:val="left"/>
+      <w:pPr>
+        <w:ind w:left="2160" w:hanging="360"/>
+      </w:pPr>
+      <w:rPr>
+        <w:rFonts w:ascii="Wingdings" w:hAnsi="Wingdings" w:hint="default"/>
+      </w:rPr>
+    </w:lvl>
+    <w:lvl w:ilvl="3" w:tplc="04090001" w:tentative="1">
+      <w:start w:val="1"/>
+      <w:numFmt w:val="bullet"/>
+      <w:lvlText w:val=""/>
+      <w:lvlJc w:val="left"/>
+      <w:pPr>
+        <w:ind w:left="2880" w:hanging="360"/>
+      </w:pPr>
+      <w:rPr>
+        <w:rFonts w:ascii="Symbol" w:hAnsi="Symbol" w:hint="default"/>
+      </w:rPr>
+    </w:lvl>
+    <w:lvl w:ilvl="4" w:tplc="04090003" w:tentative="1">
+      <w:start w:val="1"/>
+      <w:numFmt w:val="bullet"/>
+      <w:lvlText w:val="o"/>
+      <w:lvlJc w:val="left"/>
+      <w:pPr>
+        <w:ind w:left="3600" w:hanging="360"/>
+      </w:pPr>
+      <w:rPr>
+        <w:rFonts w:ascii="Courier New" w:hAnsi="Courier New" w:cs="Courier New" w:hint="default"/>
+      </w:rPr>
+    </w:lvl>
+    <w:lvl w:ilvl="5" w:tplc="04090005" w:tentative="1">
+      <w:start w:val="1"/>
+      <w:numFmt w:val="bullet"/>
+      <w:lvlText w:val=""/>
+      <w:lvlJc w:val="left"/>
+      <w:pPr>
+        <w:ind w:left="4320" w:hanging="360"/>
+      </w:pPr>
+      <w:rPr>
+        <w:rFonts w:ascii="Wingdings" w:hAnsi="Wingdings" w:hint="default"/>
+      </w:rPr>
+    </w:lvl>
+    <w:lvl w:ilvl="6" w:tplc="04090001" w:tentative="1">
+      <w:start w:val="1"/>
+      <w:numFmt w:val="bullet"/>
+      <w:lvlText w:val=""/>
+      <w:lvlJc w:val="left"/>
+      <w:pPr>
+        <w:ind w:left="5040" w:hanging="360"/>
+      </w:pPr>
+      <w:rPr>
+        <w:rFonts w:ascii="Symbol" w:hAnsi="Symbol" w:hint="default"/>
+      </w:rPr>
+    </w:lvl>
+    <w:lvl w:ilvl="7" w:tplc="04090003" w:tentative="1">
+      <w:start w:val="1"/>
+      <w:numFmt w:val="bullet"/>
+      <w:lvlText w:val="o"/>
+      <w:lvlJc w:val="left"/>
+      <w:pPr>
+        <w:ind w:left="5760" w:hanging="360"/>
+      </w:pPr>
+      <w:rPr>
+        <w:rFonts w:ascii="Courier New" w:hAnsi="Courier New" w:cs="Courier New" w:hint="default"/>
+      </w:rPr>
+    </w:lvl>
+    <w:lvl w:ilvl="8" w:tplc="04090005" w:tentative="1">
+      <w:start w:val="1"/>
+      <w:numFmt w:val="bullet"/>
+      <w:lvlText w:val=""/>
+      <w:lvlJc w:val="left"/>
+      <w:pPr>
+        <w:ind w:left="6480" w:hanging="360"/>
+      </w:pPr>
+      <w:rPr>
+        <w:rFonts w:ascii="Wingdings" w:hAnsi="Wingdings" w:hint="default"/>
+      </w:rPr>
+    </w:lvl>
+  </w:abstractNum>
+  <w:abstractNum w:abstractNumId="4" w15:restartNumberingAfterBreak="0">
     <w:nsid w:val="42493DDA"/>
     <w:multiLevelType w:val="hybridMultilevel"/>
     <w:tmpl w:val="467C5686"/>
@@ -2963,7 +3580,7 @@
       </w:rPr>
     </w:lvl>
   </w:abstractNum>
-  <w:abstractNum w:abstractNumId="3" w15:restartNumberingAfterBreak="0">
+  <w:abstractNum w:abstractNumId="5" w15:restartNumberingAfterBreak="0">
     <w:nsid w:val="45396FD4"/>
     <w:multiLevelType w:val="hybridMultilevel"/>
     <w:tmpl w:val="E8F23EF2"/>
@@ -3076,7 +3693,7 @@
       </w:rPr>
     </w:lvl>
   </w:abstractNum>
-  <w:abstractNum w:abstractNumId="4" w15:restartNumberingAfterBreak="0">
+  <w:abstractNum w:abstractNumId="6" w15:restartNumberingAfterBreak="0">
     <w:nsid w:val="59415977"/>
     <w:multiLevelType w:val="hybridMultilevel"/>
     <w:tmpl w:val="C156782C"/>
@@ -3191,7 +3808,7 @@
       </w:rPr>
     </w:lvl>
   </w:abstractNum>
-  <w:abstractNum w:abstractNumId="5" w15:restartNumberingAfterBreak="0">
+  <w:abstractNum w:abstractNumId="7" w15:restartNumberingAfterBreak="0">
     <w:nsid w:val="5BF9188A"/>
     <w:multiLevelType w:val="hybridMultilevel"/>
     <w:tmpl w:val="599657F8"/>
@@ -3304,7 +3921,7 @@
       </w:rPr>
     </w:lvl>
   </w:abstractNum>
-  <w:abstractNum w:abstractNumId="6" w15:restartNumberingAfterBreak="0">
+  <w:abstractNum w:abstractNumId="8" w15:restartNumberingAfterBreak="0">
     <w:nsid w:val="68EB5DD4"/>
     <w:multiLevelType w:val="hybridMultilevel"/>
     <w:tmpl w:val="28EC3E4A"/>
@@ -3419,7 +4036,7 @@
       </w:rPr>
     </w:lvl>
   </w:abstractNum>
-  <w:abstractNum w:abstractNumId="7" w15:restartNumberingAfterBreak="0">
+  <w:abstractNum w:abstractNumId="9" w15:restartNumberingAfterBreak="0">
     <w:nsid w:val="787C1180"/>
     <w:multiLevelType w:val="hybridMultilevel"/>
     <w:tmpl w:val="CACA3C6A"/>
@@ -3534,7 +4151,7 @@
       </w:rPr>
     </w:lvl>
   </w:abstractNum>
-  <w:abstractNum w:abstractNumId="8" w15:restartNumberingAfterBreak="0">
+  <w:abstractNum w:abstractNumId="10" w15:restartNumberingAfterBreak="0">
     <w:nsid w:val="790C207B"/>
     <w:multiLevelType w:val="hybridMultilevel"/>
     <w:tmpl w:val="958219EA"/>
@@ -3648,31 +4265,37 @@
     </w:lvl>
   </w:abstractNum>
   <w:num w:numId="1" w16cid:durableId="128859692">
+    <w:abstractNumId w:val="8"/>
+  </w:num>
+  <w:num w:numId="2" w16cid:durableId="1999993803">
+    <w:abstractNumId w:val="9"/>
+  </w:num>
+  <w:num w:numId="3" w16cid:durableId="2029870214">
+    <w:abstractNumId w:val="1"/>
+  </w:num>
+  <w:num w:numId="4" w16cid:durableId="1117531733">
+    <w:abstractNumId w:val="2"/>
+  </w:num>
+  <w:num w:numId="5" w16cid:durableId="1011567749">
     <w:abstractNumId w:val="6"/>
   </w:num>
-  <w:num w:numId="2" w16cid:durableId="1999993803">
+  <w:num w:numId="6" w16cid:durableId="1384718636">
+    <w:abstractNumId w:val="4"/>
+  </w:num>
+  <w:num w:numId="7" w16cid:durableId="852381235">
+    <w:abstractNumId w:val="5"/>
+  </w:num>
+  <w:num w:numId="8" w16cid:durableId="1182208439">
     <w:abstractNumId w:val="7"/>
   </w:num>
-  <w:num w:numId="3" w16cid:durableId="2029870214">
+  <w:num w:numId="9" w16cid:durableId="1764374794">
+    <w:abstractNumId w:val="10"/>
+  </w:num>
+  <w:num w:numId="10" w16cid:durableId="1645575419">
     <w:abstractNumId w:val="0"/>
   </w:num>
-  <w:num w:numId="4" w16cid:durableId="1117531733">
-    <w:abstractNumId w:val="1"/>
-  </w:num>
-  <w:num w:numId="5" w16cid:durableId="1011567749">
-    <w:abstractNumId w:val="4"/>
-  </w:num>
-  <w:num w:numId="6" w16cid:durableId="1384718636">
-    <w:abstractNumId w:val="2"/>
-  </w:num>
-  <w:num w:numId="7" w16cid:durableId="852381235">
+  <w:num w:numId="11" w16cid:durableId="31924674">
     <w:abstractNumId w:val="3"/>
-  </w:num>
-  <w:num w:numId="8" w16cid:durableId="1182208439">
-    <w:abstractNumId w:val="5"/>
-  </w:num>
-  <w:num w:numId="9" w16cid:durableId="1764374794">
-    <w:abstractNumId w:val="8"/>
   </w:num>
 </w:numbering>
 </file>

</xml_diff>